<commit_message>
Add partnership AI classification foundation
</commit_message>
<xml_diff>
--- a/reputation-engine/docs/partnership-relationship-playbook.docx
+++ b/reputation-engine/docs/partnership-relationship-playbook.docx
@@ -274,6 +274,17 @@
           <w:sz w:val="24"/>
           <w:sz-cs w:val="24"/>
         </w:rPr>
+        <w:t xml:space="preserve">- Friendly, not corporate: use plain phrases like "for sure," "no worries," "appreciate that," and "thanks for the update" when they fit.</w:t>
+      </w:r>
+    </w:p>
+    <w:p>
+      <w:pPr/>
+      <w:r>
+        <w:rPr>
+          <w:rFonts w:ascii="Helvetica Light" w:hAnsi="Helvetica Light" w:cs="Helvetica Light"/>
+          <w:sz w:val="24"/>
+          <w:sz-cs w:val="24"/>
+        </w:rPr>
         <w:t xml:space="preserve">- Direct answer first: if they ask for an email, website, social page, phone number, pricing, proof, or whether this is Hunter, answer that before asking anything else.</w:t>
       </w:r>
     </w:p>
@@ -373,6 +384,50 @@
           <w:sz w:val="24"/>
           <w:sz-cs w:val="24"/>
         </w:rPr>
+        <w:t xml:space="preserve">Tone rule:</w:t>
+      </w:r>
+    </w:p>
+    <w:p>
+      <w:pPr/>
+      <w:r>
+        <w:rPr>
+          <w:rFonts w:ascii="Helvetica Light" w:hAnsi="Helvetica Light" w:cs="Helvetica Light"/>
+          <w:sz w:val="24"/>
+          <w:sz-cs w:val="24"/>
+        </w:rPr>
+        <w:t xml:space="preserve"/>
+      </w:r>
+    </w:p>
+    <w:p>
+      <w:pPr/>
+      <w:r>
+        <w:rPr>
+          <w:rFonts w:ascii="Helvetica Light" w:hAnsi="Helvetica Light" w:cs="Helvetica Light"/>
+          <w:sz w:val="24"/>
+          <w:sz-cs w:val="24"/>
+        </w:rPr>
+        <w:t xml:space="preserve">The reply should feel like a capable person texting from their phone: warm, brief, and useful. Avoid stiff wording like "per our workflow," "relationship pipeline," "classified intent," or anything that sounds like a CRM note. The partner should feel helped, not processed.</w:t>
+      </w:r>
+    </w:p>
+    <w:p>
+      <w:pPr/>
+      <w:r>
+        <w:rPr>
+          <w:rFonts w:ascii="Helvetica Light" w:hAnsi="Helvetica Light" w:cs="Helvetica Light"/>
+          <w:sz w:val="24"/>
+          <w:sz-cs w:val="24"/>
+        </w:rPr>
+        <w:t xml:space="preserve"/>
+      </w:r>
+    </w:p>
+    <w:p>
+      <w:pPr/>
+      <w:r>
+        <w:rPr>
+          <w:rFonts w:ascii="Helvetica Light" w:hAnsi="Helvetica Light" w:cs="Helvetica Light"/>
+          <w:sz w:val="24"/>
+          <w:sz-cs w:val="24"/>
+        </w:rPr>
         <w:t xml:space="preserve">## Digital Package</w:t>
       </w:r>
     </w:p>
@@ -2596,6 +2651,633 @@
           <w:sz-cs w:val="24"/>
         </w:rPr>
         <w:t xml:space="preserve">- The response would mention a delivery, appointment, or sent package that has not actually happened.</w:t>
+      </w:r>
+    </w:p>
+    <w:p>
+      <w:pPr/>
+      <w:r>
+        <w:rPr>
+          <w:rFonts w:ascii="Helvetica Light" w:hAnsi="Helvetica Light" w:cs="Helvetica Light"/>
+          <w:sz w:val="24"/>
+          <w:sz-cs w:val="24"/>
+        </w:rPr>
+        <w:t xml:space="preserve"/>
+      </w:r>
+    </w:p>
+    <w:p>
+      <w:pPr/>
+      <w:r>
+        <w:rPr>
+          <w:rFonts w:ascii="Helvetica Light" w:hAnsi="Helvetica Light" w:cs="Helvetica Light"/>
+          <w:sz w:val="24"/>
+          <w:sz-cs w:val="24"/>
+        </w:rPr>
+        <w:t xml:space="preserve">## Approved Pattern Learning Loop</w:t>
+      </w:r>
+    </w:p>
+    <w:p>
+      <w:pPr/>
+      <w:r>
+        <w:rPr>
+          <w:rFonts w:ascii="Helvetica Light" w:hAnsi="Helvetica Light" w:cs="Helvetica Light"/>
+          <w:sz w:val="24"/>
+          <w:sz-cs w:val="24"/>
+        </w:rPr>
+        <w:t xml:space="preserve"/>
+      </w:r>
+    </w:p>
+    <w:p>
+      <w:pPr/>
+      <w:r>
+        <w:rPr>
+          <w:rFonts w:ascii="Helvetica Light" w:hAnsi="Helvetica Light" w:cs="Helvetica Light"/>
+          <w:sz w:val="24"/>
+          <w:sz-cs w:val="24"/>
+        </w:rPr>
+        <w:t xml:space="preserve">The long-term goal is not to manually approve every reply forever. The goal is to create a vetted library of "what John would do in this context" and let the system reuse those patterns safely.</w:t>
+      </w:r>
+    </w:p>
+    <w:p>
+      <w:pPr/>
+      <w:r>
+        <w:rPr>
+          <w:rFonts w:ascii="Helvetica Light" w:hAnsi="Helvetica Light" w:cs="Helvetica Light"/>
+          <w:sz w:val="24"/>
+          <w:sz-cs w:val="24"/>
+        </w:rPr>
+        <w:t xml:space="preserve"/>
+      </w:r>
+    </w:p>
+    <w:p>
+      <w:pPr/>
+      <w:r>
+        <w:rPr>
+          <w:rFonts w:ascii="Helvetica Light" w:hAnsi="Helvetica Light" w:cs="Helvetica Light"/>
+          <w:sz w:val="24"/>
+          <w:sz-cs w:val="24"/>
+        </w:rPr>
+        <w:t xml:space="preserve">The learning loop:</w:t>
+      </w:r>
+    </w:p>
+    <w:p>
+      <w:pPr/>
+      <w:r>
+        <w:rPr>
+          <w:rFonts w:ascii="Helvetica Light" w:hAnsi="Helvetica Light" w:cs="Helvetica Light"/>
+          <w:sz w:val="24"/>
+          <w:sz-cs w:val="24"/>
+        </w:rPr>
+        <w:t xml:space="preserve"/>
+      </w:r>
+    </w:p>
+    <w:p>
+      <w:pPr/>
+      <w:r>
+        <w:rPr>
+          <w:rFonts w:ascii="Helvetica Light" w:hAnsi="Helvetica Light" w:cs="Helvetica Light"/>
+          <w:sz w:val="24"/>
+          <w:sz-cs w:val="24"/>
+        </w:rPr>
+        <w:t xml:space="preserve">1. New inbound message arrives.</w:t>
+      </w:r>
+    </w:p>
+    <w:p>
+      <w:pPr/>
+      <w:r>
+        <w:rPr>
+          <w:rFonts w:ascii="Helvetica Light" w:hAnsi="Helvetica Light" w:cs="Helvetica Light"/>
+          <w:sz w:val="24"/>
+          <w:sz-cs w:val="24"/>
+        </w:rPr>
+        <w:t xml:space="preserve">2. System classifies the intent and extracts context.</w:t>
+      </w:r>
+    </w:p>
+    <w:p>
+      <w:pPr/>
+      <w:r>
+        <w:rPr>
+          <w:rFonts w:ascii="Helvetica Light" w:hAnsi="Helvetica Light" w:cs="Helvetica Light"/>
+          <w:sz w:val="24"/>
+          <w:sz-cs w:val="24"/>
+        </w:rPr>
+        <w:t xml:space="preserve">3. AI drafts a reply using the playbook, prior thread, market, package status, and known business facts.</w:t>
+      </w:r>
+    </w:p>
+    <w:p>
+      <w:pPr/>
+      <w:r>
+        <w:rPr>
+          <w:rFonts w:ascii="Helvetica Light" w:hAnsi="Helvetica Light" w:cs="Helvetica Light"/>
+          <w:sz w:val="24"/>
+          <w:sz-cs w:val="24"/>
+        </w:rPr>
+        <w:t xml:space="preserve">4. Human approves, edits, or rejects the draft.</w:t>
+      </w:r>
+    </w:p>
+    <w:p>
+      <w:pPr/>
+      <w:r>
+        <w:rPr>
+          <w:rFonts w:ascii="Helvetica Light" w:hAnsi="Helvetica Light" w:cs="Helvetica Light"/>
+          <w:sz w:val="24"/>
+          <w:sz-cs w:val="24"/>
+        </w:rPr>
+        <w:t xml:space="preserve">5. Approved or edited reply is stored as a reusable pattern with the inbound context that triggered it.</w:t>
+      </w:r>
+    </w:p>
+    <w:p>
+      <w:pPr/>
+      <w:r>
+        <w:rPr>
+          <w:rFonts w:ascii="Helvetica Light" w:hAnsi="Helvetica Light" w:cs="Helvetica Light"/>
+          <w:sz w:val="24"/>
+          <w:sz-cs w:val="24"/>
+        </w:rPr>
+        <w:t xml:space="preserve">6. Future similar messages are compared against approved patterns.</w:t>
+      </w:r>
+    </w:p>
+    <w:p>
+      <w:pPr/>
+      <w:r>
+        <w:rPr>
+          <w:rFonts w:ascii="Helvetica Light" w:hAnsi="Helvetica Light" w:cs="Helvetica Light"/>
+          <w:sz w:val="24"/>
+          <w:sz-cs w:val="24"/>
+        </w:rPr>
+        <w:t xml:space="preserve">7. If the match is strong and the risk is low, the system can auto-send or queue as "pre-approved."</w:t>
+      </w:r>
+    </w:p>
+    <w:p>
+      <w:pPr/>
+      <w:r>
+        <w:rPr>
+          <w:rFonts w:ascii="Helvetica Light" w:hAnsi="Helvetica Light" w:cs="Helvetica Light"/>
+          <w:sz w:val="24"/>
+          <w:sz-cs w:val="24"/>
+        </w:rPr>
+        <w:t xml:space="preserve">8. If the match is weak, sensitive, or missing context, it stays manual-approved.</w:t>
+      </w:r>
+    </w:p>
+    <w:p>
+      <w:pPr/>
+      <w:r>
+        <w:rPr>
+          <w:rFonts w:ascii="Helvetica Light" w:hAnsi="Helvetica Light" w:cs="Helvetica Light"/>
+          <w:sz w:val="24"/>
+          <w:sz-cs w:val="24"/>
+        </w:rPr>
+        <w:t xml:space="preserve"/>
+      </w:r>
+    </w:p>
+    <w:p>
+      <w:pPr/>
+      <w:r>
+        <w:rPr>
+          <w:rFonts w:ascii="Helvetica Light" w:hAnsi="Helvetica Light" w:cs="Helvetica Light"/>
+          <w:sz w:val="24"/>
+          <w:sz-cs w:val="24"/>
+        </w:rPr>
+        <w:t xml:space="preserve">This creates a controlled version of AI automation: the model can personalize and adapt wording, but the business decision and conversation strategy come from approved history.</w:t>
+      </w:r>
+    </w:p>
+    <w:p>
+      <w:pPr/>
+      <w:r>
+        <w:rPr>
+          <w:rFonts w:ascii="Helvetica Light" w:hAnsi="Helvetica Light" w:cs="Helvetica Light"/>
+          <w:sz w:val="24"/>
+          <w:sz-cs w:val="24"/>
+        </w:rPr>
+        <w:t xml:space="preserve"/>
+      </w:r>
+    </w:p>
+    <w:p>
+      <w:pPr/>
+      <w:r>
+        <w:rPr>
+          <w:rFonts w:ascii="Helvetica Light" w:hAnsi="Helvetica Light" w:cs="Helvetica Light"/>
+          <w:sz w:val="24"/>
+          <w:sz-cs w:val="24"/>
+        </w:rPr>
+        <w:t xml:space="preserve">Recommended pattern record:</w:t>
+      </w:r>
+    </w:p>
+    <w:p>
+      <w:pPr/>
+      <w:r>
+        <w:rPr>
+          <w:rFonts w:ascii="Helvetica Light" w:hAnsi="Helvetica Light" w:cs="Helvetica Light"/>
+          <w:sz w:val="24"/>
+          <w:sz-cs w:val="24"/>
+        </w:rPr>
+        <w:t xml:space="preserve"/>
+      </w:r>
+    </w:p>
+    <w:p>
+      <w:pPr/>
+      <w:r>
+        <w:rPr>
+          <w:rFonts w:ascii="Helvetica Light" w:hAnsi="Helvetica Light" w:cs="Helvetica Light"/>
+          <w:sz w:val="24"/>
+          <w:sz-cs w:val="24"/>
+        </w:rPr>
+        <w:t xml:space="preserve">```json</w:t>
+      </w:r>
+    </w:p>
+    <w:p>
+      <w:pPr/>
+      <w:r>
+        <w:rPr>
+          <w:rFonts w:ascii="Helvetica Light" w:hAnsi="Helvetica Light" w:cs="Helvetica Light"/>
+          <w:sz w:val="24"/>
+          <w:sz-cs w:val="24"/>
+        </w:rPr>
+        <w:t xml:space="preserve">{</w:t>
+      </w:r>
+    </w:p>
+    <w:p>
+      <w:pPr/>
+      <w:r>
+        <w:rPr>
+          <w:rFonts w:ascii="Helvetica Light" w:hAnsi="Helvetica Light" w:cs="Helvetica Light"/>
+          <w:sz w:val="24"/>
+          <w:sz-cs w:val="24"/>
+        </w:rPr>
+        <w:t xml:space="preserve">  "intent_category": "asks_contact_info",</w:t>
+      </w:r>
+    </w:p>
+    <w:p>
+      <w:pPr/>
+      <w:r>
+        <w:rPr>
+          <w:rFonts w:ascii="Helvetica Light" w:hAnsi="Helvetica Light" w:cs="Helvetica Light"/>
+          <w:sz w:val="24"/>
+          <w:sz-cs w:val="24"/>
+        </w:rPr>
+        <w:t xml:space="preserve">  "sample_inbound": "Is this the number I can share with clients? Do you have an email or website?",</w:t>
+      </w:r>
+    </w:p>
+    <w:p>
+      <w:pPr/>
+      <w:r>
+        <w:rPr>
+          <w:rFonts w:ascii="Helvetica Light" w:hAnsi="Helvetica Light" w:cs="Helvetica Light"/>
+          <w:sz w:val="24"/>
+          <w:sz-cs w:val="24"/>
+        </w:rPr>
+        <w:t xml:space="preserve">  "approved_strategy": "Answer phone/email/website first, then ask permission for digital package.",</w:t>
+      </w:r>
+    </w:p>
+    <w:p>
+      <w:pPr/>
+      <w:r>
+        <w:rPr>
+          <w:rFonts w:ascii="Helvetica Light" w:hAnsi="Helvetica Light" w:cs="Helvetica Light"/>
+          <w:sz w:val="24"/>
+          <w:sz-cs w:val="24"/>
+        </w:rPr>
+        <w:t xml:space="preserve">  "approved_draft": "Absolutely Rami, yes, this number works for clients too. Our email is info@starmovers.ca and our website is starmovers.ca. Is it okay if I send the full digital package here too?",</w:t>
+      </w:r>
+    </w:p>
+    <w:p>
+      <w:pPr/>
+      <w:r>
+        <w:rPr>
+          <w:rFonts w:ascii="Helvetica Light" w:hAnsi="Helvetica Light" w:cs="Helvetica Light"/>
+          <w:sz w:val="24"/>
+          <w:sz-cs w:val="24"/>
+        </w:rPr>
+        <w:t xml:space="preserve">  "required_context": {</w:t>
+      </w:r>
+    </w:p>
+    <w:p>
+      <w:pPr/>
+      <w:r>
+        <w:rPr>
+          <w:rFonts w:ascii="Helvetica Light" w:hAnsi="Helvetica Light" w:cs="Helvetica Light"/>
+          <w:sz w:val="24"/>
+          <w:sz-cs w:val="24"/>
+        </w:rPr>
+        <w:t xml:space="preserve">    "package_permission_granted": false,</w:t>
+      </w:r>
+    </w:p>
+    <w:p>
+      <w:pPr/>
+      <w:r>
+        <w:rPr>
+          <w:rFonts w:ascii="Helvetica Light" w:hAnsi="Helvetica Light" w:cs="Helvetica Light"/>
+          <w:sz w:val="24"/>
+          <w:sz-cs w:val="24"/>
+        </w:rPr>
+        <w:t xml:space="preserve">    "has_public_contact_info": true,</w:t>
+      </w:r>
+    </w:p>
+    <w:p>
+      <w:pPr/>
+      <w:r>
+        <w:rPr>
+          <w:rFonts w:ascii="Helvetica Light" w:hAnsi="Helvetica Light" w:cs="Helvetica Light"/>
+          <w:sz w:val="24"/>
+          <w:sz-cs w:val="24"/>
+        </w:rPr>
+        <w:t xml:space="preserve">    "is_opt_out": false</w:t>
+      </w:r>
+    </w:p>
+    <w:p>
+      <w:pPr/>
+      <w:r>
+        <w:rPr>
+          <w:rFonts w:ascii="Helvetica Light" w:hAnsi="Helvetica Light" w:cs="Helvetica Light"/>
+          <w:sz w:val="24"/>
+          <w:sz-cs w:val="24"/>
+        </w:rPr>
+        <w:t xml:space="preserve">  },</w:t>
+      </w:r>
+    </w:p>
+    <w:p>
+      <w:pPr/>
+      <w:r>
+        <w:rPr>
+          <w:rFonts w:ascii="Helvetica Light" w:hAnsi="Helvetica Light" w:cs="Helvetica Light"/>
+          <w:sz w:val="24"/>
+          <w:sz-cs w:val="24"/>
+        </w:rPr>
+        <w:t xml:space="preserve">  "auto_send_eligible": true,</w:t>
+      </w:r>
+    </w:p>
+    <w:p>
+      <w:pPr/>
+      <w:r>
+        <w:rPr>
+          <w:rFonts w:ascii="Helvetica Light" w:hAnsi="Helvetica Light" w:cs="Helvetica Light"/>
+          <w:sz w:val="24"/>
+          <w:sz-cs w:val="24"/>
+        </w:rPr>
+        <w:t xml:space="preserve">  "min_confidence": 0.9,</w:t>
+      </w:r>
+    </w:p>
+    <w:p>
+      <w:pPr/>
+      <w:r>
+        <w:rPr>
+          <w:rFonts w:ascii="Helvetica Light" w:hAnsi="Helvetica Light" w:cs="Helvetica Light"/>
+          <w:sz w:val="24"/>
+          <w:sz-cs w:val="24"/>
+        </w:rPr>
+        <w:t xml:space="preserve">  "risk_blocks": ["mentions_pricing_specifics", "asks_legal_question", "angry_or_confused", "missing_thread_context"]</w:t>
+      </w:r>
+    </w:p>
+    <w:p>
+      <w:pPr/>
+      <w:r>
+        <w:rPr>
+          <w:rFonts w:ascii="Helvetica Light" w:hAnsi="Helvetica Light" w:cs="Helvetica Light"/>
+          <w:sz w:val="24"/>
+          <w:sz-cs w:val="24"/>
+        </w:rPr>
+        <w:t xml:space="preserve">}</w:t>
+      </w:r>
+    </w:p>
+    <w:p>
+      <w:pPr/>
+      <w:r>
+        <w:rPr>
+          <w:rFonts w:ascii="Helvetica Light" w:hAnsi="Helvetica Light" w:cs="Helvetica Light"/>
+          <w:sz w:val="24"/>
+          <w:sz-cs w:val="24"/>
+        </w:rPr>
+        <w:t xml:space="preserve">```</w:t>
+      </w:r>
+    </w:p>
+    <w:p>
+      <w:pPr/>
+      <w:r>
+        <w:rPr>
+          <w:rFonts w:ascii="Helvetica Light" w:hAnsi="Helvetica Light" w:cs="Helvetica Light"/>
+          <w:sz w:val="24"/>
+          <w:sz-cs w:val="24"/>
+        </w:rPr>
+        <w:t xml:space="preserve"/>
+      </w:r>
+    </w:p>
+    <w:p>
+      <w:pPr/>
+      <w:r>
+        <w:rPr>
+          <w:rFonts w:ascii="Helvetica Light" w:hAnsi="Helvetica Light" w:cs="Helvetica Light"/>
+          <w:sz w:val="24"/>
+          <w:sz-cs w:val="24"/>
+        </w:rPr>
+        <w:t xml:space="preserve">Auto-send should require all of these:</w:t>
+      </w:r>
+    </w:p>
+    <w:p>
+      <w:pPr/>
+      <w:r>
+        <w:rPr>
+          <w:rFonts w:ascii="Helvetica Light" w:hAnsi="Helvetica Light" w:cs="Helvetica Light"/>
+          <w:sz w:val="24"/>
+          <w:sz-cs w:val="24"/>
+        </w:rPr>
+        <w:t xml:space="preserve"/>
+      </w:r>
+    </w:p>
+    <w:p>
+      <w:pPr/>
+      <w:r>
+        <w:rPr>
+          <w:rFonts w:ascii="Helvetica Light" w:hAnsi="Helvetica Light" w:cs="Helvetica Light"/>
+          <w:sz w:val="24"/>
+          <w:sz-cs w:val="24"/>
+        </w:rPr>
+        <w:t xml:space="preserve">- Intent matches an approved pattern.</w:t>
+      </w:r>
+    </w:p>
+    <w:p>
+      <w:pPr/>
+      <w:r>
+        <w:rPr>
+          <w:rFonts w:ascii="Helvetica Light" w:hAnsi="Helvetica Light" w:cs="Helvetica Light"/>
+          <w:sz w:val="24"/>
+          <w:sz-cs w:val="24"/>
+        </w:rPr>
+        <w:t xml:space="preserve">- Latest inbound and prior outbound context are similar enough.</w:t>
+      </w:r>
+    </w:p>
+    <w:p>
+      <w:pPr/>
+      <w:r>
+        <w:rPr>
+          <w:rFonts w:ascii="Helvetica Light" w:hAnsi="Helvetica Light" w:cs="Helvetica Light"/>
+          <w:sz w:val="24"/>
+          <w:sz-cs w:val="24"/>
+        </w:rPr>
+        <w:t xml:space="preserve">- No new unapproved facts are needed.</w:t>
+      </w:r>
+    </w:p>
+    <w:p>
+      <w:pPr/>
+      <w:r>
+        <w:rPr>
+          <w:rFonts w:ascii="Helvetica Light" w:hAnsi="Helvetica Light" w:cs="Helvetica Light"/>
+          <w:sz w:val="24"/>
+          <w:sz-cs w:val="24"/>
+        </w:rPr>
+        <w:t xml:space="preserve">- Package permission rule is satisfied if a link/media is included.</w:t>
+      </w:r>
+    </w:p>
+    <w:p>
+      <w:pPr/>
+      <w:r>
+        <w:rPr>
+          <w:rFonts w:ascii="Helvetica Light" w:hAnsi="Helvetica Light" w:cs="Helvetica Light"/>
+          <w:sz w:val="24"/>
+          <w:sz-cs w:val="24"/>
+        </w:rPr>
+        <w:t xml:space="preserve">- The generated message stays within the approved strategy.</w:t>
+      </w:r>
+    </w:p>
+    <w:p>
+      <w:pPr/>
+      <w:r>
+        <w:rPr>
+          <w:rFonts w:ascii="Helvetica Light" w:hAnsi="Helvetica Light" w:cs="Helvetica Light"/>
+          <w:sz w:val="24"/>
+          <w:sz-cs w:val="24"/>
+        </w:rPr>
+        <w:t xml:space="preserve">- The message does not introduce pricing, payout terms, testimonials, or delivery commitments that are not verified.</w:t>
+      </w:r>
+    </w:p>
+    <w:p>
+      <w:pPr/>
+      <w:r>
+        <w:rPr>
+          <w:rFonts w:ascii="Helvetica Light" w:hAnsi="Helvetica Light" w:cs="Helvetica Light"/>
+          <w:sz w:val="24"/>
+          <w:sz-cs w:val="24"/>
+        </w:rPr>
+        <w:t xml:space="preserve"/>
+      </w:r>
+    </w:p>
+    <w:p>
+      <w:pPr/>
+      <w:r>
+        <w:rPr>
+          <w:rFonts w:ascii="Helvetica Light" w:hAnsi="Helvetica Light" w:cs="Helvetica Light"/>
+          <w:sz w:val="24"/>
+          <w:sz-cs w:val="24"/>
+        </w:rPr>
+        <w:t xml:space="preserve">If those are not true, the system should still draft, but it should ask for human approval.</w:t>
+      </w:r>
+    </w:p>
+    <w:p>
+      <w:pPr/>
+      <w:r>
+        <w:rPr>
+          <w:rFonts w:ascii="Helvetica Light" w:hAnsi="Helvetica Light" w:cs="Helvetica Light"/>
+          <w:sz w:val="24"/>
+          <w:sz-cs w:val="24"/>
+        </w:rPr>
+        <w:t xml:space="preserve"/>
+      </w:r>
+    </w:p>
+    <w:p>
+      <w:pPr/>
+      <w:r>
+        <w:rPr>
+          <w:rFonts w:ascii="Helvetica Light" w:hAnsi="Helvetica Light" w:cs="Helvetica Light"/>
+          <w:sz w:val="24"/>
+          <w:sz-cs w:val="24"/>
+        </w:rPr>
+        <w:t xml:space="preserve">The practical operator flow:</w:t>
+      </w:r>
+    </w:p>
+    <w:p>
+      <w:pPr/>
+      <w:r>
+        <w:rPr>
+          <w:rFonts w:ascii="Helvetica Light" w:hAnsi="Helvetica Light" w:cs="Helvetica Light"/>
+          <w:sz w:val="24"/>
+          <w:sz-cs w:val="24"/>
+        </w:rPr>
+        <w:t xml:space="preserve"/>
+      </w:r>
+    </w:p>
+    <w:p>
+      <w:pPr/>
+      <w:r>
+        <w:rPr>
+          <w:rFonts w:ascii="Helvetica Light" w:hAnsi="Helvetica Light" w:cs="Helvetica Light"/>
+          <w:sz w:val="24"/>
+          <w:sz-cs w:val="24"/>
+        </w:rPr>
+        <w:t xml:space="preserve">- `Approve`: send this reply and mark the pattern as useful.</w:t>
+      </w:r>
+    </w:p>
+    <w:p>
+      <w:pPr/>
+      <w:r>
+        <w:rPr>
+          <w:rFonts w:ascii="Helvetica Light" w:hAnsi="Helvetica Light" w:cs="Helvetica Light"/>
+          <w:sz w:val="24"/>
+          <w:sz-cs w:val="24"/>
+        </w:rPr>
+        <w:t xml:space="preserve">- `Approve similar`: allow future similar conversations to be auto-eligible.</w:t>
+      </w:r>
+    </w:p>
+    <w:p>
+      <w:pPr/>
+      <w:r>
+        <w:rPr>
+          <w:rFonts w:ascii="Helvetica Light" w:hAnsi="Helvetica Light" w:cs="Helvetica Light"/>
+          <w:sz w:val="24"/>
+          <w:sz-cs w:val="24"/>
+        </w:rPr>
+        <w:t xml:space="preserve">- `Edit and approve`: store the edited version as the better canonical pattern.</w:t>
+      </w:r>
+    </w:p>
+    <w:p>
+      <w:pPr/>
+      <w:r>
+        <w:rPr>
+          <w:rFonts w:ascii="Helvetica Light" w:hAnsi="Helvetica Light" w:cs="Helvetica Light"/>
+          <w:sz w:val="24"/>
+          <w:sz-cs w:val="24"/>
+        </w:rPr>
+        <w:t xml:space="preserve">- `Reject`: block that pattern from auto-sending.</w:t>
+      </w:r>
+    </w:p>
+    <w:p>
+      <w:pPr/>
+      <w:r>
+        <w:rPr>
+          <w:rFonts w:ascii="Helvetica Light" w:hAnsi="Helvetica Light" w:cs="Helvetica Light"/>
+          <w:sz w:val="24"/>
+          <w:sz-cs w:val="24"/>
+        </w:rPr>
+        <w:t xml:space="preserve">- `Human only`: keep this class manual forever or until more examples are reviewed.</w:t>
+      </w:r>
+    </w:p>
+    <w:p>
+      <w:pPr/>
+      <w:r>
+        <w:rPr>
+          <w:rFonts w:ascii="Helvetica Light" w:hAnsi="Helvetica Light" w:cs="Helvetica Light"/>
+          <w:sz w:val="24"/>
+          <w:sz-cs w:val="24"/>
+        </w:rPr>
+        <w:t xml:space="preserve"/>
+      </w:r>
+    </w:p>
+    <w:p>
+      <w:pPr/>
+      <w:r>
+        <w:rPr>
+          <w:rFonts w:ascii="Helvetica Light" w:hAnsi="Helvetica Light" w:cs="Helvetica Light"/>
+          <w:sz w:val="24"/>
+          <w:sz-cs w:val="24"/>
+        </w:rPr>
+        <w:t xml:space="preserve">This is how the system gradually moves from manual draft review to safe automation without losing the human tone.</w:t>
       </w:r>
     </w:p>
     <w:p>

</xml_diff>